<commit_message>
Add outline and visual structure; align slide cues with speaker script
</commit_message>
<xml_diff>
--- a/authentic-self-presentation/Speaker_Script_EN_ZH.docx
+++ b/authentic-self-presentation/Speaker_Script_EN_ZH.docx
@@ -12,12 +12,12 @@
     </w:p>
     <w:p>
       <w:r>
-        <w:t>约四分钟英文演讲｜6 页正文 + 1 页参考文献｜英文约 326 词</w:t>
+        <w:t>新版｜目录 + 7 页演讲正文（含标题）+ 1 页参考文献｜英文约 338 词｜约四分钟，按个人语速调整</w:t>
       </w:r>
     </w:p>
     <w:p>
       <w:r>
-        <w:t>使用方法：PPT 的提示句与下面台词顺序一致。中文只用于练习，不需要念。每段之间可以自然停顿；[Pause] 表示稍停。按慢速约每分钟 100 词并加少量停顿，整体约四分钟，实际时长以练习为准。完整台词也已放在 PPT 备注区。</w:t>
+        <w:t>练习方法：每页先看“PPT 提示顺序”，再读台词。提示句尽量沿用台词原词，按相同顺序出现。中文不需要念。开场问题后停 2–3 秒，各页之间自然停顿。完整台词也在 PPT 备注区。</w:t>
       </w:r>
     </w:p>
     <w:p>
@@ -30,12 +30,12 @@
     </w:p>
     <w:p>
       <w:r>
-        <w:t>思路提示：开场：问 MBTI → 停一下 → 引出自己的问题。</w:t>
+        <w:t>中文思路：开场：问 MBTI → 停一下 → 引出自己的问题。</w:t>
       </w:r>
     </w:p>
     <w:p>
       <w:r>
-        <w:t>PPT 提示：What’s your MBTI? → Is that the whole story?</w:t>
+        <w:t>PPT 提示顺序：What’s your MBTI? → Do those four letters really tell us who you are? → Do we need to try so hard to find our authentic self?</w:t>
       </w:r>
     </w:p>
     <w:p>
@@ -45,7 +45,7 @@
     </w:p>
     <w:p>
       <w:r>
-        <w:t>接下一页：Do we need to search so hard?</w:t>
+        <w:t>翻页后开头：Here is my outline: why worry less? We are more than a label, and we change.</w:t>
       </w:r>
     </w:p>
     <w:p>
@@ -53,17 +53,45 @@
         <w:pStyle w:val="Heading1"/>
       </w:pPr>
       <w:r>
-        <w:t>2. Do we need to search so hard?</w:t>
+        <w:t>2. Today’s outline</w:t>
       </w:r>
     </w:p>
     <w:p>
       <w:r>
-        <w:t>思路提示：转折：以前觉得寻找自己很重要 → 现在觉得不必一直纠结。</w:t>
+        <w:t>中文思路：目录：为什么少纠结 → 标签不完整 → 人会变化 → 怎么做。简单带过，不展开。</w:t>
       </w:r>
     </w:p>
     <w:p>
       <w:r>
-        <w:t>PPT 提示：I used to ask: “Who am I, really?” → Now I ask: “Do I need a fixed answer?” → Maybe we can worry less and live more.</w:t>
+        <w:t>PPT 提示顺序：Why worry less? → We are more than a label. → We change. → What can we do?</w:t>
+      </w:r>
+    </w:p>
+    <w:p>
+      <w:r>
+        <w:t>Here is my outline: why worry less? We are more than a label, and we change. Then, what can we do?</w:t>
+      </w:r>
+    </w:p>
+    <w:p>
+      <w:r>
+        <w:t>翻页后开头：I used to think finding my true self was very important.</w:t>
+      </w:r>
+    </w:p>
+    <w:p>
+      <w:pPr>
+        <w:pStyle w:val="Heading1"/>
+      </w:pPr>
+      <w:r>
+        <w:t>3. Do we need to search so hard?</w:t>
+      </w:r>
+    </w:p>
+    <w:p>
+      <w:r>
+        <w:t>中文思路：转折：以前觉得寻找自己很重要 → 现在觉得不必一直纠结。</w:t>
+      </w:r>
+    </w:p>
+    <w:p>
+      <w:r>
+        <w:t>PPT 提示顺序：Finding my true self was very important. → Recently, I changed my view. → We can live a little more freely.</w:t>
       </w:r>
     </w:p>
     <w:p>
@@ -73,7 +101,7 @@
     </w:p>
     <w:p>
       <w:r>
-        <w:t>接下一页：First, we are more complicated than a label.</w:t>
+        <w:t>翻页后开头：First, we are more complicated than a label.</w:t>
       </w:r>
     </w:p>
     <w:p>
@@ -81,27 +109,27 @@
         <w:pStyle w:val="Heading1"/>
       </w:pPr>
       <w:r>
-        <w:t>3. We are more than a label.</w:t>
+        <w:t>4. We are more than a label.</w:t>
       </w:r>
     </w:p>
     <w:p>
       <w:r>
-        <w:t>思路提示：理由一：内向也能表达，外向也想独处 → 标签只描述一部分。</w:t>
+        <w:t>中文思路：理由一：内向也能表达，外向也想独处 → 标签只描述一部分。</w:t>
       </w:r>
     </w:p>
     <w:p>
       <w:r>
-        <w:t>PPT 提示：An introvert can enjoy speaking up. → An extrovert can need time alone. → A label describes part of us.</w:t>
+        <w:t>PPT 提示顺序：An introvert can enjoy speaking up. → An extrovert can want a quiet evening alone. → Labels don’t have to decide what we can do.</w:t>
       </w:r>
     </w:p>
     <w:p>
       <w:r>
-        <w:t>First, we are more complicated than a label. An introvert can enjoy speaking up about something they love. An extrovert can want a quiet evening alone. Neither has to be pretending. Labels can help us describe ourselves, but they don’t have to decide what we can do.</w:t>
+        <w:t>First, we are more complicated than a label. An introvert can enjoy speaking up. An extrovert can want a quiet evening alone. Neither has to be pretending. Labels can help us describe ourselves. But labels don’t have to decide what we can do.</w:t>
       </w:r>
     </w:p>
     <w:p>
       <w:r>
-        <w:t>接下一页：Second, we change.</w:t>
+        <w:t>翻页后开头：Second, we change.</w:t>
       </w:r>
     </w:p>
     <w:p>
@@ -109,27 +137,27 @@
         <w:pStyle w:val="Heading1"/>
       </w:pPr>
       <w:r>
-        <w:t>4. We also change over time.</w:t>
+        <w:t>5. We also change over time.</w:t>
       </w:r>
     </w:p>
     <w:p>
       <w:r>
-        <w:t>思路提示：理由二：看图 → 只讲 calmness，约 42% 更平静 → 人格有稳定也有变化。</w:t>
+        <w:t>中文思路：理由二：看图 → 只讲 calmness，约 42% 更平静 → 人格有稳定也有变化。</w:t>
       </w:r>
     </w:p>
     <w:p>
       <w:r>
-        <w:t>PPT 提示：1,795 people → 50 years later → about 42% became calmer → we can change</w:t>
+        <w:t>PPT 提示顺序：1,795 people · fifty years later → About forty-two percent became calmer. → Today’s description may not be the final one.</w:t>
       </w:r>
     </w:p>
     <w:p>
       <w:r>
-        <w:t>Second, we change. Researchers compared the personalities of 1,795 people in adolescence and fifty years later. This chart shows three of the measured traits. For example, about forty-two percent became calmer. Some stayed similar, while others changed. So today’s description of ourselves may not be the final one.</w:t>
+        <w:t>Second, we change. Researchers compared the personalities of 1,795 people in adolescence and fifty years later. This chart shows three of the measured traits. About forty-two percent became calmer. Some stayed similar, while others changed. Today’s description may not be the final one.</w:t>
       </w:r>
     </w:p>
     <w:p>
       <w:r>
-        <w:t>接下一页：So, what can we do?</w:t>
+        <w:t>翻页后开头：So, what can we do? When something really matters, our wishes or doubts may become clearer.</w:t>
       </w:r>
     </w:p>
     <w:p>
@@ -137,17 +165,17 @@
         <w:pStyle w:val="Heading1"/>
       </w:pPr>
       <w:r>
-        <w:t>5. When it matters, listen carefully.</w:t>
+        <w:t>6. When it matters, listen carefully.</w:t>
       </w:r>
     </w:p>
     <w:p>
       <w:r>
-        <w:t>思路提示：做法：留意想法 → 认真考虑 → 问别人。紧张与想表达可以同时存在。</w:t>
+        <w:t>中文思路：做法：留意想法 → 认真考虑 → 问别人。紧张与想表达可以同时存在。</w:t>
       </w:r>
     </w:p>
     <w:p>
       <w:r>
-        <w:t>PPT 提示：Notice: “What do I really want?” → Pause: “Why does this matter to me?” → Ask others: “What am I missing?”</w:t>
+        <w:t>PPT 提示顺序：Notice them, then take time to think. → Both feelings can be real. → Finding ourselves doesn’t mean refusing help.</w:t>
       </w:r>
     </w:p>
     <w:p>
@@ -157,7 +185,7 @@
     </w:p>
     <w:p>
       <w:r>
-        <w:t>接下一页：So, what’s your MBTI?</w:t>
+        <w:t>翻页后开头：So, what’s your MBTI? Whatever your answer is, it doesn’t have to be the whole story.</w:t>
       </w:r>
     </w:p>
     <w:p>
@@ -165,17 +193,17 @@
         <w:pStyle w:val="Heading1"/>
       </w:pPr>
       <w:r>
-        <w:t>6. You don’t need a final definition.</w:t>
+        <w:t>7. You don’t need a final definition.</w:t>
       </w:r>
     </w:p>
     <w:p>
       <w:r>
-        <w:t>思路提示：结尾：回扣 MBTI → 好好生活 → 重要时刻思考 → 听别人意见 → 最后一句。</w:t>
+        <w:t>中文思路：结尾：回扣 MBTI → 好好生活 → 重要时刻思考 → 听别人意见 → 最后一句。</w:t>
       </w:r>
     </w:p>
     <w:p>
       <w:r>
-        <w:t>PPT 提示：Live your life. → Think carefully when it matters. → Let others help you see more clearly.</w:t>
+        <w:t>PPT 提示顺序：It doesn’t have to be the whole story. → Take time to consider what you want. → Listen to others, too.</w:t>
       </w:r>
     </w:p>
     <w:p>
@@ -184,203 +212,18 @@
       </w:r>
     </w:p>
     <w:p>
-      <w:r>
-        <w:t>接下一页：Thank you.</w:t>
-      </w:r>
-    </w:p>
-    <w:p>
       <w:pPr>
         <w:pStyle w:val="Heading1"/>
       </w:pPr>
       <w:r>
-        <w:t>数据说明与来源（不用念）</w:t>
+        <w:t>数据与出处（不用念）</w:t>
       </w:r>
     </w:p>
     <w:p>
       <w:r>
-        <w:t>研究对象：1,795 名美国参与者，比较青少年时期与 50 年后自报的人格特质。图表从原文 Table 7 选取三个量表，按原始百分比重绘。No reliable change 指未达到研究采用的可靠变化阈值，不代表绝对毫无变化。该研究不是 MBTI 测试，也没有直接证明“不需要寻找自我”；后者是本次演讲提出的观点。</w:t>
+        <w:t>图表依据原文 Table 7，选取 Calmness、Self-confidence 和 Sociability 三项量表，按原始比例重绘。三项对应的“上升”比例分别为 41.9%、37.3%、21.4%。讲稿只解释第一项，约 42% 更平静。No reliable change 指未达到研究采用的可靠变化阈值，不代表完全没有变化。该研究不是 MBTI 测试。</w:t>
       </w:r>
     </w:p>
-    <w:tbl>
-      <w:tblPr>
-        <w:tblW w:type="auto" w:w="0"/>
-        <w:tblLook w:firstColumn="1" w:firstRow="1" w:lastColumn="0" w:lastRow="0" w:noHBand="0" w:noVBand="1" w:val="04A0"/>
-      </w:tblPr>
-      <w:tblGrid>
-        <w:gridCol w:w="2160"/>
-        <w:gridCol w:w="2160"/>
-        <w:gridCol w:w="2160"/>
-        <w:gridCol w:w="2160"/>
-      </w:tblGrid>
-      <w:tr>
-        <w:tc>
-          <w:tcPr>
-            <w:tcW w:type="dxa" w:w="2160"/>
-          </w:tcPr>
-          <w:p>
-            <w:r>
-              <w:t>量表</w:t>
-            </w:r>
-          </w:p>
-        </w:tc>
-        <w:tc>
-          <w:tcPr>
-            <w:tcW w:type="dxa" w:w="2160"/>
-          </w:tcPr>
-          <w:p>
-            <w:r>
-              <w:t>下降 %</w:t>
-            </w:r>
-          </w:p>
-        </w:tc>
-        <w:tc>
-          <w:tcPr>
-            <w:tcW w:type="dxa" w:w="2160"/>
-          </w:tcPr>
-          <w:p>
-            <w:r>
-              <w:t>未达可靠变化 %</w:t>
-            </w:r>
-          </w:p>
-        </w:tc>
-        <w:tc>
-          <w:tcPr>
-            <w:tcW w:type="dxa" w:w="2160"/>
-          </w:tcPr>
-          <w:p>
-            <w:r>
-              <w:t>上升 %</w:t>
-            </w:r>
-          </w:p>
-        </w:tc>
-      </w:tr>
-      <w:tr>
-        <w:tc>
-          <w:tcPr>
-            <w:tcW w:type="dxa" w:w="2160"/>
-          </w:tcPr>
-          <w:p>
-            <w:r>
-              <w:t>Calmness</w:t>
-            </w:r>
-          </w:p>
-        </w:tc>
-        <w:tc>
-          <w:tcPr>
-            <w:tcW w:type="dxa" w:w="2160"/>
-          </w:tcPr>
-          <w:p>
-            <w:r>
-              <w:t>3.4</w:t>
-            </w:r>
-          </w:p>
-        </w:tc>
-        <w:tc>
-          <w:tcPr>
-            <w:tcW w:type="dxa" w:w="2160"/>
-          </w:tcPr>
-          <w:p>
-            <w:r>
-              <w:t>54.7</w:t>
-            </w:r>
-          </w:p>
-        </w:tc>
-        <w:tc>
-          <w:tcPr>
-            <w:tcW w:type="dxa" w:w="2160"/>
-          </w:tcPr>
-          <w:p>
-            <w:r>
-              <w:t>41.9</w:t>
-            </w:r>
-          </w:p>
-        </w:tc>
-      </w:tr>
-      <w:tr>
-        <w:tc>
-          <w:tcPr>
-            <w:tcW w:type="dxa" w:w="2160"/>
-          </w:tcPr>
-          <w:p>
-            <w:r>
-              <w:t>Self-confidence</w:t>
-            </w:r>
-          </w:p>
-        </w:tc>
-        <w:tc>
-          <w:tcPr>
-            <w:tcW w:type="dxa" w:w="2160"/>
-          </w:tcPr>
-          <w:p>
-            <w:r>
-              <w:t>10.2</w:t>
-            </w:r>
-          </w:p>
-        </w:tc>
-        <w:tc>
-          <w:tcPr>
-            <w:tcW w:type="dxa" w:w="2160"/>
-          </w:tcPr>
-          <w:p>
-            <w:r>
-              <w:t>52.5</w:t>
-            </w:r>
-          </w:p>
-        </w:tc>
-        <w:tc>
-          <w:tcPr>
-            <w:tcW w:type="dxa" w:w="2160"/>
-          </w:tcPr>
-          <w:p>
-            <w:r>
-              <w:t>37.3</w:t>
-            </w:r>
-          </w:p>
-        </w:tc>
-      </w:tr>
-      <w:tr>
-        <w:tc>
-          <w:tcPr>
-            <w:tcW w:type="dxa" w:w="2160"/>
-          </w:tcPr>
-          <w:p>
-            <w:r>
-              <w:t>Sociability</w:t>
-            </w:r>
-          </w:p>
-        </w:tc>
-        <w:tc>
-          <w:tcPr>
-            <w:tcW w:type="dxa" w:w="2160"/>
-          </w:tcPr>
-          <w:p>
-            <w:r>
-              <w:t>12.3</w:t>
-            </w:r>
-          </w:p>
-        </w:tc>
-        <w:tc>
-          <w:tcPr>
-            <w:tcW w:type="dxa" w:w="2160"/>
-          </w:tcPr>
-          <w:p>
-            <w:r>
-              <w:t>66.3</w:t>
-            </w:r>
-          </w:p>
-        </w:tc>
-        <w:tc>
-          <w:tcPr>
-            <w:tcW w:type="dxa" w:w="2160"/>
-          </w:tcPr>
-          <w:p>
-            <w:r>
-              <w:t>21.4</w:t>
-            </w:r>
-          </w:p>
-        </w:tc>
-      </w:tr>
-    </w:tbl>
     <w:p>
       <w:r>
         <w:t>Damian, R. I., Spengler, M., Sutu, A., &amp; Roberts, B. W. (2019).</w:t>
@@ -410,12 +253,12 @@
         <w:pStyle w:val="Heading1"/>
       </w:pPr>
       <w:r>
-        <w:t>上台前只记这条路线</w:t>
+        <w:t>只记这条路线</w:t>
       </w:r>
     </w:p>
     <w:p>
       <w:r>
-        <w:t>MBTI → 不必一直找答案 → 标签不完整 → 人会变化 → 重要时刻认真思考、听取意见 → 回扣 MBTI。</w:t>
+        <w:t>MBTI → 目录 → 换个角度 → 人比标签复杂 → 人会变化 → 重要时刻想清楚，也听取意见 → 回扣 MBTI。</w:t>
       </w:r>
     </w:p>
     <w:sectPr>

</xml_diff>

<commit_message>
Add brief summary, simplify advice, and cue MBTI callback in uploaded deck
</commit_message>
<xml_diff>
--- a/authentic-self-presentation/Speaker_Script_EN_ZH.docx
+++ b/authentic-self-presentation/Speaker_Script_EN_ZH.docx
@@ -11,16 +11,6 @@
       </w:r>
     </w:p>
     <w:p>
-      <w:r>
-        <w:t>新版｜目录 + 7 页演讲正文（含标题）+ 1 页参考文献｜英文约 338 词｜约四分钟，按个人语速调整</w:t>
-      </w:r>
-    </w:p>
-    <w:p>
-      <w:r>
-        <w:t>练习方法：每页先看“PPT 提示顺序”，再读台词。提示句尽量沿用台词原词，按相同顺序出现。中文不需要念。开场问题后停 2–3 秒，各页之间自然停顿。完整台词也在 PPT 备注区。</w:t>
-      </w:r>
-    </w:p>
-    <w:p>
       <w:pPr>
         <w:pStyle w:val="Heading1"/>
       </w:pPr>
@@ -30,12 +20,12 @@
     </w:p>
     <w:p>
       <w:r>
-        <w:t>中文思路：开场：问 MBTI → 停一下 → 引出自己的问题。</w:t>
+        <w:t>中文提示：开场：问 MBTI → 停一下 → 引出自己的问题。</w:t>
       </w:r>
     </w:p>
     <w:p>
       <w:r>
-        <w:t>PPT 提示顺序：What’s your MBTI? → Do those four letters really tell us who you are? → Do we need to try so hard to find our authentic self?</w:t>
+        <w:t>页面提示：? → What’s your MBTI? → Do those four letters really tell us who you are? → Do we need to try so hard to find our authentic self?</w:t>
       </w:r>
     </w:p>
     <w:p>
@@ -44,54 +34,21 @@
       </w:r>
     </w:p>
     <w:p>
-      <w:r>
-        <w:t>翻页后开头：Here is my outline: why worry less? We are more than a label, and we change.</w:t>
-      </w:r>
-    </w:p>
-    <w:p>
       <w:pPr>
         <w:pStyle w:val="Heading1"/>
       </w:pPr>
       <w:r>
-        <w:t>2. Today’s outline</w:t>
+        <w:t>2. Do we need to search so hard?</w:t>
       </w:r>
     </w:p>
     <w:p>
       <w:r>
-        <w:t>中文思路：目录：为什么少纠结 → 标签不完整 → 人会变化 → 怎么做。简单带过，不展开。</w:t>
+        <w:t>中文提示：转折：以前觉得寻找自己很重要 → 现在觉得不必一直纠结。</w:t>
       </w:r>
     </w:p>
     <w:p>
       <w:r>
-        <w:t>PPT 提示顺序：Why worry less? → We are more than a label. → We change. → What can we do?</w:t>
-      </w:r>
-    </w:p>
-    <w:p>
-      <w:r>
-        <w:t>Here is my outline: why worry less? We are more than a label, and we change. Then, what can we do?</w:t>
-      </w:r>
-    </w:p>
-    <w:p>
-      <w:r>
-        <w:t>翻页后开头：I used to think finding my true self was very important.</w:t>
-      </w:r>
-    </w:p>
-    <w:p>
-      <w:pPr>
-        <w:pStyle w:val="Heading1"/>
-      </w:pPr>
-      <w:r>
-        <w:t>3. Do we need to search so hard?</w:t>
-      </w:r>
-    </w:p>
-    <w:p>
-      <w:r>
-        <w:t>中文思路：转折：以前觉得寻找自己很重要 → 现在觉得不必一直纠结。</w:t>
-      </w:r>
-    </w:p>
-    <w:p>
-      <w:r>
-        <w:t>PPT 提示顺序：Finding my true self was very important. → Recently, I changed my view. → We can live a little more freely.</w:t>
+        <w:t>页面提示：I USED TO THINK → Finding my true self was very important. → NOW I THINK → Recently, I changed my view. → We can live a little more freely.</w:t>
       </w:r>
     </w:p>
     <w:p>
@@ -100,8 +57,26 @@
       </w:r>
     </w:p>
     <w:p>
+      <w:pPr>
+        <w:pStyle w:val="Heading1"/>
+      </w:pPr>
       <w:r>
-        <w:t>翻页后开头：First, we are more complicated than a label.</w:t>
+        <w:t>3. Today’s outline</w:t>
+      </w:r>
+    </w:p>
+    <w:p>
+      <w:r>
+        <w:t>中文提示：目录：为什么少纠结 → 标签不完整 → 人会变化 → 怎么做。简单带过，不展开。</w:t>
+      </w:r>
+    </w:p>
+    <w:p>
+      <w:r>
+        <w:t>页面提示：01 → Why worry less? → 02 → We are more than a label. → 03 → We always change. → 04 → What can we do?</w:t>
+      </w:r>
+    </w:p>
+    <w:p>
+      <w:r>
+        <w:t>Here is my outline: why worry less? We are more than a label, and we change. Then, what can we do?</w:t>
       </w:r>
     </w:p>
     <w:p>
@@ -114,22 +89,17 @@
     </w:p>
     <w:p>
       <w:r>
-        <w:t>中文思路：理由一：内向也能表达，外向也想独处 → 标签只描述一部分。</w:t>
+        <w:t>中文提示：理由一：内向也能表达，外向也想独处 → 标签只描述一部分。</w:t>
       </w:r>
     </w:p>
     <w:p>
       <w:r>
-        <w:t>PPT 提示顺序：An introvert can enjoy speaking up. → An extrovert can want a quiet evening alone. → Labels don’t have to decide what we can do.</w:t>
+        <w:t>页面提示：INTROVERT → An introvert can enjoy speaking up. → EXTROVERT → An extrovert can want a quiet evening alone. → Labels don’t have to decide what we can do.</w:t>
       </w:r>
     </w:p>
     <w:p>
       <w:r>
         <w:t>First, we are more complicated than a label. An introvert can enjoy speaking up. An extrovert can want a quiet evening alone. Neither has to be pretending. Labels can help us describe ourselves. But labels don’t have to decide what we can do.</w:t>
-      </w:r>
-    </w:p>
-    <w:p>
-      <w:r>
-        <w:t>翻页后开头：Second, we change.</w:t>
       </w:r>
     </w:p>
     <w:p>
@@ -142,12 +112,14 @@
     </w:p>
     <w:p>
       <w:r>
-        <w:t>中文思路：理由二：看图 → 只讲 calmness，约 42% 更平静 → 人格有稳定也有变化。</w:t>
+        <w:t>中文提示：理由二：看图 → 只讲 calmness，约 42% 更平静 → 人格有稳定也有变化。</w:t>
       </w:r>
     </w:p>
     <w:p>
       <w:r>
-        <w:t>PPT 提示顺序：1,795 people · fifty years later → About forty-two percent became calmer. → Today’s description may not be the final one.</w:t>
+        <w:t>页面提示：1,795 people · fifty years later → ≈42% → became</w:t>
+        <w:br/>
+        <w:t>calmer → Who we are today may not be the final one.</w:t>
       </w:r>
     </w:p>
     <w:p>
@@ -156,8 +128,26 @@
       </w:r>
     </w:p>
     <w:p>
+      <w:pPr>
+        <w:pStyle w:val="Heading1"/>
+      </w:pPr>
       <w:r>
-        <w:t>翻页后开头：So, what can we do? When something really matters, our wishes or doubts may become clearer.</w:t>
+        <w:t>6. So, why worry less?</w:t>
+      </w:r>
+    </w:p>
+    <w:p>
+      <w:r>
+        <w:t>中文提示：小总结：人很复杂 → 人也会变化 → 不必急着找固定答案。</w:t>
+      </w:r>
+    </w:p>
+    <w:p>
+      <w:r>
+        <w:t>页面提示：WE ARE COMPLEX. → One label cannot tell the whole story. → WE CAN CHANGE. → Who we are today may change over time. → We don’t need a fixed answer to “Who am I?”</w:t>
+      </w:r>
+    </w:p>
+    <w:p>
+      <w:r>
+        <w:t>So, why worry less? We are complex, and we can change. One label cannot tell the whole story. We don’t need a fixed answer to “Who am I?”</w:t>
       </w:r>
     </w:p>
     <w:p>
@@ -165,27 +155,22 @@
         <w:pStyle w:val="Heading1"/>
       </w:pPr>
       <w:r>
-        <w:t>6. When it matters, listen carefully.</w:t>
+        <w:t>7. When it matters, ask yourself.</w:t>
       </w:r>
     </w:p>
     <w:p>
       <w:r>
-        <w:t>中文思路：做法：留意想法 → 认真考虑 → 问别人。紧张与想表达可以同时存在。</w:t>
+        <w:t>中文提示：做法：问自己想要什么 → 不急着决定 → 听取不同意见，自己选择。</w:t>
       </w:r>
     </w:p>
     <w:p>
       <w:r>
-        <w:t>PPT 提示顺序：Notice them, then take time to think. → Both feelings can be real. → Finding ourselves doesn’t mean refusing help.</w:t>
+        <w:t>页面提示：ASK YOURSELF → What do I really want? → TAKE YOUR TIME → Think before you decide. → ASK OTHER PEOPLE → Listen to different views. The choice is yours.</w:t>
       </w:r>
     </w:p>
     <w:p>
       <w:r>
-        <w:t>So, what can we do? When something really matters, our wishes or doubts may become clearer. Notice them, then take time to think. For example, I may feel nervous about a presentation, but still want to share my ideas. Both feelings can be real. We can also ask other people for different views. Finding ourselves doesn’t mean refusing help.</w:t>
-      </w:r>
-    </w:p>
-    <w:p>
-      <w:r>
-        <w:t>翻页后开头：So, what’s your MBTI? Whatever your answer is, it doesn’t have to be the whole story.</w:t>
+        <w:t>So, what can we do? When something matters, ask yourself: “What do I really want?” Take your time. Think before you decide. You can also ask other people for help. Listen to different views. The choice is yours. Finding yourself doesn’t mean doing everything alone.</w:t>
       </w:r>
     </w:p>
     <w:p>
@@ -193,72 +178,34 @@
         <w:pStyle w:val="Heading1"/>
       </w:pPr>
       <w:r>
-        <w:t>7. You don’t need a final definition.</w:t>
+        <w:t>8. So, what’s your MBTI?</w:t>
       </w:r>
     </w:p>
     <w:p>
       <w:r>
-        <w:t>中文思路：结尾：回扣 MBTI → 好好生活 → 重要时刻思考 → 听别人意见 → 最后一句。</w:t>
+        <w:t>中文提示：结尾：MBTI → 只是你的一部分 → 好好生活 → 重要时刻思考 → 听意见、自己选 → 最后一句。</w:t>
       </w:r>
     </w:p>
     <w:p>
       <w:r>
-        <w:t>PPT 提示顺序：It doesn’t have to be the whole story. → Take time to consider what you want. → Listen to others, too.</w:t>
+        <w:t>页面提示：Your type is only part of your story. → Live your life. Think when it matters. → Listen to others. Make your own choice. → You don’t need a final definition of yourself</w:t>
+        <w:br/>
+        <w:t>to make choices that matter to you.</w:t>
       </w:r>
     </w:p>
     <w:p>
       <w:r>
-        <w:t>So, what’s your MBTI? Whatever your answer is, it doesn’t have to be the whole story. You don’t need to figure yourself out once and for all. Live your life, and when something really matters, take time to consider what you want. Listen to others, too—not to let them define you, but to help you see more clearly. You don’t need a final definition of yourself to make choices that matter to you. Thank you.</w:t>
-      </w:r>
-    </w:p>
-    <w:p>
-      <w:pPr>
-        <w:pStyle w:val="Heading1"/>
-      </w:pPr>
-      <w:r>
-        <w:t>数据与出处（不用念）</w:t>
+        <w:t>So, what’s your MBTI? Your type is only part of your story. You don’t need to figure yourself out once and for all. Live your life. When something matters, take time to consider what you want. Listen to others, and make your own choice. You don’t need a final definition of yourself to make choices that matter to you. Thank you.</w:t>
       </w:r>
     </w:p>
     <w:p>
       <w:r>
-        <w:t>图表依据原文 Table 7，选取 Calmness、Self-confidence 和 Sociability 三项量表，按原始比例重绘。三项对应的“上升”比例分别为 41.9%、37.3%、21.4%。讲稿只解释第一项，约 42% 更平静。No reliable change 指未达到研究采用的可靠变化阈值，不代表完全没有变化。该研究不是 MBTI 测试。</w:t>
+        <w:t>英文约 337 词，按约四分钟准备，实际时长以慢速练习为准。参考文献页不需要讲。</w:t>
       </w:r>
     </w:p>
     <w:p>
       <w:r>
-        <w:t>Damian, R. I., Spengler, M., Sutu, A., &amp; Roberts, B. W. (2019).</w:t>
-        <w:br/>
-        <w:t>Sixteen going on sixty-six: A longitudinal study of personality stability</w:t>
-        <w:br/>
-        <w:t>and change across 50 years. Journal of Personality and Social Psychology,</w:t>
-        <w:br/>
-        <w:t>117(3), 674–695. https://doi.org/10.1037/pspp0000210</w:t>
-        <w:br/>
-        <w:t>Chart: selected rows from Table 7, p. 688; percentages are not MBTI results.</w:t>
-      </w:r>
-    </w:p>
-    <w:p>
-      <w:r>
-        <w:t>Sah, S. (2025, January 7). How to Say No and Mean It. Psychology Today.</w:t>
-        <w:br/>
-        <w:t>Kam, K. (2024, November 7). Authenticity can protect mental health.</w:t>
-        <w:br/>
-        <w:t>Here’s how to be authentic. The Washington Post.</w:t>
-        <w:br/>
-        <w:t>Both readings were provided as course documents.</w:t>
-      </w:r>
-    </w:p>
-    <w:p>
-      <w:pPr>
-        <w:pStyle w:val="Heading1"/>
-      </w:pPr>
-      <w:r>
-        <w:t>只记这条路线</w:t>
-      </w:r>
-    </w:p>
-    <w:p>
-      <w:r>
-        <w:t>MBTI → 目录 → 换个角度 → 人比标签复杂 → 人会变化 → 重要时刻想清楚，也听取意见 → 回扣 MBTI。</w:t>
+        <w:t>图表来源：Damian et al. (2019), Table 7, p. 688. https://doi.org/10.1037/pspp0000210。研究并非 MBTI 测试。</w:t>
       </w:r>
     </w:p>
     <w:sectPr>

</xml_diff>

<commit_message>
Add separate transition, takeaway and thank-you slides with matching script
</commit_message>
<xml_diff>
--- a/authentic-self-presentation/Speaker_Script_EN_ZH.docx
+++ b/authentic-self-presentation/Speaker_Script_EN_ZH.docx
@@ -8,6 +8,11 @@
       </w:pPr>
       <w:r>
         <w:t>Finding Your Authentic Self or Not</w:t>
+      </w:r>
+    </w:p>
+    <w:p>
+      <w:r>
+        <w:t>分步提示版｜11 页演讲页面 + 1 页参考文献｜过渡页只说一两句话，留出翻页停顿。</w:t>
       </w:r>
     </w:p>
     <w:p>
@@ -117,9 +122,7 @@
     </w:p>
     <w:p>
       <w:r>
-        <w:t>页面提示：1,795 people · fifty years later → ≈42% → became</w:t>
-        <w:br/>
-        <w:t>calmer → Who we are today may not be the final one.</w:t>
+        <w:t>页面提示：1,795 people · fifty years later → ≈42% → became / calmer → Who we are today may not be the final one.</w:t>
       </w:r>
     </w:p>
     <w:p>
@@ -155,7 +158,30 @@
         <w:pStyle w:val="Heading1"/>
       </w:pPr>
       <w:r>
-        <w:t>7. When it matters, ask yourself.</w:t>
+        <w:t>7. So, what can we do?</w:t>
+      </w:r>
+    </w:p>
+    <w:p>
+      <w:r>
+        <w:t>中文提示：过渡页：总结之后，停一下，问“那我们可以怎么做？”然后翻页。</w:t>
+      </w:r>
+    </w:p>
+    <w:p>
+      <w:r>
+        <w:t>页面提示：So, what can we do? → When something matters, take time to think.</w:t>
+      </w:r>
+    </w:p>
+    <w:p>
+      <w:r>
+        <w:t>So, what can we do?</w:t>
+      </w:r>
+    </w:p>
+    <w:p>
+      <w:pPr>
+        <w:pStyle w:val="Heading1"/>
+      </w:pPr>
+      <w:r>
+        <w:t>8. When it matters, ask yourself.</w:t>
       </w:r>
     </w:p>
     <w:p>
@@ -170,7 +196,7 @@
     </w:p>
     <w:p>
       <w:r>
-        <w:t>So, what can we do? When something matters, ask yourself: “What do I really want?” Take your time. Think before you decide. You can also ask other people for help. Listen to different views. The choice is yours. Finding yourself doesn’t mean doing everything alone.</w:t>
+        <w:t>When something matters, ask yourself: “What do I really want?” Take your time. Think before you decide. You can also ask other people for help. Listen to different views. The choice is yours. Finding yourself doesn’t mean doing everything alone.</w:t>
       </w:r>
     </w:p>
     <w:p>
@@ -178,34 +204,78 @@
         <w:pStyle w:val="Heading1"/>
       </w:pPr>
       <w:r>
-        <w:t>8. So, what’s your MBTI?</w:t>
+        <w:t>9. So, what’s your MBTI?</w:t>
       </w:r>
     </w:p>
     <w:p>
       <w:r>
-        <w:t>中文提示：结尾：MBTI → 只是你的一部分 → 好好生活 → 重要时刻思考 → 听意见、自己选 → 最后一句。</w:t>
+        <w:t>中文提示：回扣页：再次问 MBTI → 标签只是你的一部分 → 不必一次性把自己想清楚。</w:t>
       </w:r>
     </w:p>
     <w:p>
       <w:r>
-        <w:t>页面提示：Your type is only part of your story. → Live your life. Think when it matters. → Listen to others. Make your own choice. → You don’t need a final definition of yourself</w:t>
-        <w:br/>
-        <w:t>to make choices that matter to you.</w:t>
+        <w:t>页面提示：So, what’s your MBTI? → Your type is only part of your story. / You don’t need to figure yourself out once and for all.</w:t>
       </w:r>
     </w:p>
     <w:p>
       <w:r>
-        <w:t>So, what’s your MBTI? Your type is only part of your story. You don’t need to figure yourself out once and for all. Live your life. When something matters, take time to consider what you want. Listen to others, and make your own choice. You don’t need a final definition of yourself to make choices that matter to you. Thank you.</w:t>
+        <w:t>So, what’s your MBTI? Your type is only part of your story. You don’t need to figure yourself out once and for all.</w:t>
+      </w:r>
+    </w:p>
+    <w:p>
+      <w:pPr>
+        <w:pStyle w:val="Heading1"/>
+      </w:pPr>
+      <w:r>
+        <w:t>10. You don’t need a final definition of yourself to make choices that matter to you.</w:t>
       </w:r>
     </w:p>
     <w:p>
       <w:r>
-        <w:t>英文约 337 词，按约四分钟准备，实际时长以慢速练习为准。参考文献页不需要讲。</w:t>
+        <w:t>中文提示：核心结论页：先用三句短句收束，再慢慢念大字结论。</w:t>
       </w:r>
     </w:p>
     <w:p>
       <w:r>
-        <w:t>图表来源：Damian et al. (2019), Table 7, p. 688. https://doi.org/10.1037/pspp0000210。研究并非 MBTI 测试。</w:t>
+        <w:t>页面提示：You don’t need a final definition / of yourself to make choices / that matter to you. → Live your life. Think when it matters. Listen to others.</w:t>
+      </w:r>
+    </w:p>
+    <w:p>
+      <w:r>
+        <w:t>Live your life. When something matters, take time to consider what you want. Listen to others, and make your own choice. You don’t need a final definition of yourself to make choices that matter to you.</w:t>
+      </w:r>
+    </w:p>
+    <w:p>
+      <w:pPr>
+        <w:pStyle w:val="Heading1"/>
+      </w:pPr>
+      <w:r>
+        <w:t>11. Thank you.</w:t>
+      </w:r>
+    </w:p>
+    <w:p>
+      <w:r>
+        <w:t>中文提示：结束页：说谢谢，停一下结束。</w:t>
+      </w:r>
+    </w:p>
+    <w:p>
+      <w:r>
+        <w:t>页面提示：Thank you.</w:t>
+      </w:r>
+    </w:p>
+    <w:p>
+      <w:r>
+        <w:t>Thank you.</w:t>
+      </w:r>
+    </w:p>
+    <w:p>
+      <w:r>
+        <w:t>英文约 337 词。整体仍按约四分钟准备；新增页主要用于提示和停顿，不必额外展开。</w:t>
+      </w:r>
+    </w:p>
+    <w:p>
+      <w:r>
+        <w:t>研究图表来源：Damian et al. (2019), Table 7, p. 688. https://doi.org/10.1037/pspp0000210。参考文献页放在 Thank you 后，不需要讲。</w:t>
       </w:r>
     </w:p>
     <w:sectPr>

</xml_diff>